<commit_message>
Banned berries yield cultivars - added cultivars' icons and data to all pbs needed
</commit_message>
<xml_diff>
--- a/Plugins/TDW Berry Core and Dex/Setup and Documentation.docx
+++ b/Plugins/TDW Berry Core and Dex/Setup and Documentation.docx
@@ -1,9 +1,475 @@
 
 <file path=word/document.xml><?xml version="1.0" encoding="utf-8"?>
-<w:document xmlns:wpc="http://schemas.microsoft.com/office/word/2010/wordprocessingCanvas" xmlns:cx="http://schemas.microsoft.com/office/drawing/2014/chartex" xmlns:cx1="http://schemas.microsoft.com/office/drawing/2015/9/8/chartex" xmlns:cx2="http://schemas.microsoft.com/office/drawing/2015/10/21/chartex" xmlns:cx3="http://schemas.microsoft.com/office/drawing/2016/5/9/chartex" xmlns:cx4="http://schemas.microsoft.com/office/drawing/2016/5/10/chartex" xmlns:cx5="http://schemas.microsoft.com/office/drawing/2016/5/11/chartex" xmlns:cx6="http://schemas.microsoft.com/office/drawing/2016/5/12/chartex" xmlns:cx7="http://schemas.microsoft.com/office/drawing/2016/5/13/chartex" xmlns:cx8="http://schemas.microsoft.com/office/drawing/2016/5/14/chartex" xmlns:mc="http://schemas.openxmlformats.org/markup-compatibility/2006" xmlns:aink="http://schemas.microsoft.com/office/drawing/2016/ink" xmlns:am3d="http://schemas.microsoft.com/office/drawing/2017/model3d" xmlns:o="urn:schemas-microsoft-com:office:office" xmlns:oel="http://schemas.microsoft.com/office/2019/extlst" xmlns:r="http://schemas.openxmlformats.org/officeDocument/2006/relationships" xmlns:m="http://schemas.openxmlformats.org/officeDocument/2006/math" xmlns:v="urn:schemas-microsoft-com:vml" xmlns:wp14="http://schemas.microsoft.com/office/word/2010/wordprocessingDrawing" xmlns:wp="http://schemas.openxmlformats.org/drawingml/2006/wordprocessingDrawing" xmlns:w10="urn:schemas-microsoft-com:office:word" xmlns:w="http://schemas.openxmlformats.org/wordprocessingml/2006/main" xmlns:w14="http://schemas.microsoft.com/office/word/2010/wordml" xmlns:w15="http://schemas.microsoft.com/office/word/2012/wordml" xmlns:w16cex="http://schemas.microsoft.com/office/word/2018/wordml/cex" xmlns:w16cid="http://schemas.microsoft.com/office/word/2016/wordml/cid" xmlns:w16="http://schemas.microsoft.com/office/word/2018/wordml" xmlns:w16sdtdh="http://schemas.microsoft.com/office/word/2020/wordml/sdtdatahash" xmlns:w16se="http://schemas.microsoft.com/office/word/2015/wordml/symex" xmlns:wpg="http://schemas.microsoft.com/office/word/2010/wordprocessingGroup" xmlns:wpi="http://schemas.microsoft.com/office/word/2010/wordprocessingInk" xmlns:wne="http://schemas.microsoft.com/office/word/2006/wordml" xmlns:wps="http://schemas.microsoft.com/office/word/2010/wordprocessingShape" mc:Ignorable="w14 w15 w16se w16cid w16 w16cex w16sdtdh wp14">
+<w:document xmlns:wpc="http://schemas.microsoft.com/office/word/2010/wordprocessingCanvas" xmlns:cx="http://schemas.microsoft.com/office/drawing/2014/chartex" xmlns:cx1="http://schemas.microsoft.com/office/drawing/2015/9/8/chartex" xmlns:cx2="http://schemas.microsoft.com/office/drawing/2015/10/21/chartex" xmlns:cx3="http://schemas.microsoft.com/office/drawing/2016/5/9/chartex" xmlns:cx4="http://schemas.microsoft.com/office/drawing/2016/5/10/chartex" xmlns:cx5="http://schemas.microsoft.com/office/drawing/2016/5/11/chartex" xmlns:cx6="http://schemas.microsoft.com/office/drawing/2016/5/12/chartex" xmlns:cx7="http://schemas.microsoft.com/office/drawing/2016/5/13/chartex" xmlns:cx8="http://schemas.microsoft.com/office/drawing/2016/5/14/chartex" xmlns:mc="http://schemas.openxmlformats.org/markup-compatibility/2006" xmlns:aink="http://schemas.microsoft.com/office/drawing/2016/ink" xmlns:am3d="http://schemas.microsoft.com/office/drawing/2017/model3d" xmlns:o="urn:schemas-microsoft-com:office:office" xmlns:oel="http://schemas.microsoft.com/office/2019/extlst" xmlns:r="http://schemas.openxmlformats.org/officeDocument/2006/relationships" xmlns:m="http://schemas.openxmlformats.org/officeDocument/2006/math" xmlns:v="urn:schemas-microsoft-com:vml" xmlns:wp14="http://schemas.microsoft.com/office/word/2010/wordprocessingDrawing" xmlns:wp="http://schemas.openxmlformats.org/drawingml/2006/wordprocessingDrawing" xmlns:w10="urn:schemas-microsoft-com:office:word" xmlns:w="http://schemas.openxmlformats.org/wordprocessingml/2006/main" xmlns:w14="http://schemas.microsoft.com/office/word/2010/wordml" xmlns:w15="http://schemas.microsoft.com/office/word/2012/wordml" xmlns:w16cex="http://schemas.microsoft.com/office/word/2018/wordml/cex" xmlns:w16cid="http://schemas.microsoft.com/office/word/2016/wordml/cid" xmlns:w16="http://schemas.microsoft.com/office/word/2018/wordml" xmlns:w16du="http://schemas.microsoft.com/office/word/2023/wordml/word16du" xmlns:w16sdtdh="http://schemas.microsoft.com/office/word/2020/wordml/sdtdatahash" xmlns:w16sdtfl="http://schemas.microsoft.com/office/word/2024/wordml/sdtformatlock" xmlns:w16se="http://schemas.microsoft.com/office/word/2015/wordml/symex" xmlns:wpg="http://schemas.microsoft.com/office/word/2010/wordprocessingGroup" xmlns:wpi="http://schemas.microsoft.com/office/word/2010/wordprocessingInk" xmlns:wne="http://schemas.microsoft.com/office/word/2006/wordml" xmlns:wps="http://schemas.microsoft.com/office/word/2010/wordprocessingShape" mc:Ignorable="w14 w15 w16se w16cid w16 w16cex w16sdtdh w16sdtfl w16du wp14">
   <w:body>
     <w:p>
-      <w:r>
+      <w:pPr>
+        <w:rPr>
+          <w:highlight w:val="red"/>
+        </w:rPr>
+      </w:pPr>
+      <w:r>
+        <w:rPr>
+          <w:b/>
+          <w:bCs/>
+          <w:sz w:val="28"/>
+          <w:szCs w:val="28"/>
+          <w:highlight w:val="red"/>
+          <w:u w:val="single"/>
+        </w:rPr>
+        <w:t xml:space="preserve">Basic </w:t>
+      </w:r>
+      <w:r>
+        <w:rPr>
+          <w:b/>
+          <w:bCs/>
+          <w:sz w:val="28"/>
+          <w:szCs w:val="28"/>
+          <w:highlight w:val="red"/>
+          <w:u w:val="single"/>
+        </w:rPr>
+        <w:t>Setup</w:t>
+      </w:r>
+    </w:p>
+    <w:p>
+      <w:pPr>
+        <w:pStyle w:val="ListParagraph"/>
+        <w:numPr>
+          <w:ilvl w:val="0"/>
+          <w:numId w:val="1"/>
+        </w:numPr>
+        <w:rPr>
+          <w:highlight w:val="red"/>
+        </w:rPr>
+      </w:pPr>
+      <w:r>
+        <w:rPr>
+          <w:b/>
+          <w:bCs/>
+          <w:highlight w:val="red"/>
+        </w:rPr>
+        <w:t xml:space="preserve">Create a backup of your project. </w:t>
+      </w:r>
+      <w:r>
+        <w:rPr>
+          <w:highlight w:val="red"/>
+        </w:rPr>
+        <w:t>I’m 96% sure nothing in my plugin will break your project, but it never hurts to back it up</w:t>
+      </w:r>
+      <w:r>
+        <w:rPr>
+          <w:highlight w:val="red"/>
+        </w:rPr>
+        <w:t xml:space="preserve"> before installing </w:t>
+      </w:r>
+      <w:r>
+        <w:rPr>
+          <w:highlight w:val="red"/>
+        </w:rPr>
+        <w:t xml:space="preserve">a new </w:t>
+      </w:r>
+      <w:r>
+        <w:rPr>
+          <w:highlight w:val="red"/>
+        </w:rPr>
+        <w:t>plugin</w:t>
+      </w:r>
+      <w:r>
+        <w:rPr>
+          <w:highlight w:val="red"/>
+        </w:rPr>
+        <w:t>.</w:t>
+      </w:r>
+    </w:p>
+    <w:p>
+      <w:pPr>
+        <w:pStyle w:val="ListParagraph"/>
+        <w:numPr>
+          <w:ilvl w:val="0"/>
+          <w:numId w:val="1"/>
+        </w:numPr>
+        <w:rPr>
+          <w:highlight w:val="red"/>
+        </w:rPr>
+      </w:pPr>
+      <w:r>
+        <w:rPr>
+          <w:highlight w:val="red"/>
+        </w:rPr>
+        <w:t xml:space="preserve">Install the </w:t>
+      </w:r>
+      <w:r>
+        <w:rPr>
+          <w:highlight w:val="red"/>
+        </w:rPr>
+        <w:t>TDW Berry Core and Dex</w:t>
+      </w:r>
+      <w:r>
+        <w:rPr>
+          <w:highlight w:val="red"/>
+        </w:rPr>
+        <w:t xml:space="preserve"> </w:t>
+      </w:r>
+      <w:r>
+        <w:rPr>
+          <w:highlight w:val="red"/>
+        </w:rPr>
+        <w:t>plugin</w:t>
+      </w:r>
+      <w:r>
+        <w:rPr>
+          <w:highlight w:val="red"/>
+        </w:rPr>
+        <w:t xml:space="preserve"> by copying </w:t>
+      </w:r>
+      <w:r>
+        <w:rPr>
+          <w:highlight w:val="red"/>
+        </w:rPr>
+        <w:t>it</w:t>
+      </w:r>
+      <w:r>
+        <w:rPr>
+          <w:highlight w:val="red"/>
+        </w:rPr>
+        <w:t xml:space="preserve"> into your project’s Plugins folder.</w:t>
+      </w:r>
+    </w:p>
+    <w:p>
+      <w:pPr>
+        <w:pStyle w:val="ListParagraph"/>
+        <w:numPr>
+          <w:ilvl w:val="0"/>
+          <w:numId w:val="1"/>
+        </w:numPr>
+        <w:rPr>
+          <w:highlight w:val="red"/>
+        </w:rPr>
+      </w:pPr>
+      <w:r>
+        <w:rPr>
+          <w:highlight w:val="red"/>
+        </w:rPr>
+        <w:t xml:space="preserve">Move the files in the Graphics and PBS folders </w:t>
+      </w:r>
+      <w:r>
+        <w:rPr>
+          <w:highlight w:val="red"/>
+        </w:rPr>
+        <w:t>included</w:t>
+      </w:r>
+      <w:r>
+        <w:rPr>
+          <w:highlight w:val="red"/>
+        </w:rPr>
+        <w:t xml:space="preserve"> into the same respective folders in your project.</w:t>
+      </w:r>
+    </w:p>
+    <w:p>
+      <w:pPr>
+        <w:pStyle w:val="ListParagraph"/>
+        <w:numPr>
+          <w:ilvl w:val="0"/>
+          <w:numId w:val="1"/>
+        </w:numPr>
+      </w:pPr>
+      <w:r>
+        <w:rPr>
+          <w:highlight w:val="red"/>
+        </w:rPr>
+        <w:t xml:space="preserve">Explore the settings in </w:t>
+      </w:r>
+      <w:r>
+        <w:rPr>
+          <w:highlight w:val="red"/>
+        </w:rPr>
+        <w:t xml:space="preserve">Plugins &gt; </w:t>
+      </w:r>
+      <w:r>
+        <w:rPr>
+          <w:highlight w:val="red"/>
+        </w:rPr>
+        <w:t>TDW Berry Core and Dex</w:t>
+      </w:r>
+      <w:r>
+        <w:rPr>
+          <w:highlight w:val="red"/>
+        </w:rPr>
+        <w:t xml:space="preserve"> &gt; 000_Settings</w:t>
+      </w:r>
+      <w:r>
+        <w:rPr>
+          <w:highlight w:val="red"/>
+        </w:rPr>
+        <w:t>.</w:t>
+      </w:r>
+    </w:p>
+    <w:p>
+      <w:pPr>
+        <w:pStyle w:val="ListParagraph"/>
+        <w:numPr>
+          <w:ilvl w:val="0"/>
+          <w:numId w:val="1"/>
+        </w:numPr>
+        <w:rPr>
+          <w:highlight w:val="red"/>
+        </w:rPr>
+      </w:pPr>
+      <w:r>
+        <w:rPr>
+          <w:highlight w:val="red"/>
+        </w:rPr>
+        <w:t xml:space="preserve">Edit the </w:t>
+      </w:r>
+      <w:proofErr w:type="spellStart"/>
+      <w:r>
+        <w:rPr>
+          <w:highlight w:val="red"/>
+        </w:rPr>
+        <w:t>berry_dexes</w:t>
+      </w:r>
+      <w:proofErr w:type="spellEnd"/>
+      <w:r>
+        <w:rPr>
+          <w:highlight w:val="red"/>
+        </w:rPr>
+        <w:t xml:space="preserve"> file in PBS as you wish for your game. Similar to setting up a </w:t>
+      </w:r>
+      <w:proofErr w:type="spellStart"/>
+      <w:r>
+        <w:rPr>
+          <w:highlight w:val="red"/>
+        </w:rPr>
+        <w:t>Pokedex</w:t>
+      </w:r>
+      <w:proofErr w:type="spellEnd"/>
+      <w:r>
+        <w:rPr>
+          <w:highlight w:val="red"/>
+        </w:rPr>
+        <w:t xml:space="preserve">, define the list and order Berries will appear. Currently, only the [0] </w:t>
+      </w:r>
+      <w:proofErr w:type="spellStart"/>
+      <w:r>
+        <w:rPr>
+          <w:highlight w:val="red"/>
+        </w:rPr>
+        <w:t>dex</w:t>
+      </w:r>
+      <w:proofErr w:type="spellEnd"/>
+      <w:r>
+        <w:rPr>
+          <w:highlight w:val="red"/>
+        </w:rPr>
+        <w:t xml:space="preserve"> will be respected, but multiple </w:t>
+      </w:r>
+      <w:proofErr w:type="spellStart"/>
+      <w:r>
+        <w:rPr>
+          <w:highlight w:val="red"/>
+        </w:rPr>
+        <w:t>Berrydexes</w:t>
+      </w:r>
+      <w:proofErr w:type="spellEnd"/>
+      <w:r>
+        <w:rPr>
+          <w:highlight w:val="red"/>
+        </w:rPr>
+        <w:t xml:space="preserve"> may be supported in the future.</w:t>
+      </w:r>
+    </w:p>
+    <w:p>
+      <w:pPr>
+        <w:pStyle w:val="ListParagraph"/>
+        <w:numPr>
+          <w:ilvl w:val="0"/>
+          <w:numId w:val="1"/>
+        </w:numPr>
+      </w:pPr>
+      <w:r>
+        <w:t xml:space="preserve">Edit the </w:t>
+      </w:r>
+      <w:proofErr w:type="spellStart"/>
+      <w:r>
+        <w:t>berry_data</w:t>
+      </w:r>
+      <w:proofErr w:type="spellEnd"/>
+      <w:r>
+        <w:t xml:space="preserve"> file in PBS as you wish for your game.</w:t>
+      </w:r>
+    </w:p>
+    <w:p>
+      <w:pPr>
+        <w:pStyle w:val="ListParagraph"/>
+        <w:numPr>
+          <w:ilvl w:val="1"/>
+          <w:numId w:val="1"/>
+        </w:numPr>
+      </w:pPr>
+      <w:r>
+        <w:t xml:space="preserve">By default, the item description for the berry will show </w:t>
+      </w:r>
+      <w:r>
+        <w:t xml:space="preserve">in the Battle page of the </w:t>
+      </w:r>
+      <w:proofErr w:type="spellStart"/>
+      <w:r>
+        <w:t>Berrydex</w:t>
+      </w:r>
+      <w:proofErr w:type="spellEnd"/>
+      <w:r>
+        <w:t xml:space="preserve">. However, not all descriptions would fit this. You can customize what description to show here by including a </w:t>
+      </w:r>
+      <w:proofErr w:type="spellStart"/>
+      <w:r>
+        <w:t>BattleDescription</w:t>
+      </w:r>
+      <w:proofErr w:type="spellEnd"/>
+      <w:r>
+        <w:t xml:space="preserve"> </w:t>
+      </w:r>
+      <w:r>
+        <w:t xml:space="preserve">line </w:t>
+      </w:r>
+      <w:r>
+        <w:t xml:space="preserve">for the berry in the </w:t>
+      </w:r>
+      <w:proofErr w:type="spellStart"/>
+      <w:r>
+        <w:t>berry_data</w:t>
+      </w:r>
+      <w:proofErr w:type="spellEnd"/>
+      <w:r>
+        <w:t xml:space="preserve"> file</w:t>
+      </w:r>
+      <w:r>
+        <w:t xml:space="preserve"> to show that, instead.</w:t>
+      </w:r>
+    </w:p>
+    <w:p>
+      <w:pPr>
+        <w:pStyle w:val="ListParagraph"/>
+        <w:numPr>
+          <w:ilvl w:val="0"/>
+          <w:numId w:val="1"/>
+        </w:numPr>
+        <w:rPr>
+          <w:b/>
+          <w:bCs/>
+        </w:rPr>
+      </w:pPr>
+      <w:r>
+        <w:rPr>
+          <w:b/>
+          <w:bCs/>
+        </w:rPr>
+        <w:t>If you have custom Berries...</w:t>
+      </w:r>
+    </w:p>
+    <w:p>
+      <w:pPr>
+        <w:pStyle w:val="ListParagraph"/>
+        <w:numPr>
+          <w:ilvl w:val="1"/>
+          <w:numId w:val="1"/>
+        </w:numPr>
+      </w:pPr>
+      <w:r>
+        <w:t xml:space="preserve">Open the </w:t>
+      </w:r>
+      <w:proofErr w:type="spellStart"/>
+      <w:r>
+        <w:t>berry_data</w:t>
+      </w:r>
+      <w:proofErr w:type="spellEnd"/>
+      <w:r>
+        <w:t xml:space="preserve"> file in PBS.</w:t>
+      </w:r>
+    </w:p>
+    <w:p>
+      <w:pPr>
+        <w:pStyle w:val="ListParagraph"/>
+        <w:numPr>
+          <w:ilvl w:val="1"/>
+          <w:numId w:val="1"/>
+        </w:numPr>
+        <w:rPr>
+          <w:b/>
+          <w:bCs/>
+        </w:rPr>
+      </w:pPr>
+      <w:r>
+        <w:t xml:space="preserve">Define each of your custom berries. </w:t>
+      </w:r>
+      <w:r>
+        <w:rPr>
+          <w:b/>
+          <w:bCs/>
+        </w:rPr>
+        <w:t xml:space="preserve">Without setting this up, using your custom berries </w:t>
+      </w:r>
+      <w:r>
+        <w:rPr>
+          <w:b/>
+          <w:bCs/>
+        </w:rPr>
+        <w:t xml:space="preserve">for </w:t>
+      </w:r>
+      <w:r>
+        <w:rPr>
+          <w:b/>
+          <w:bCs/>
+        </w:rPr>
+        <w:t>some features</w:t>
+      </w:r>
+      <w:r>
+        <w:rPr>
+          <w:b/>
+          <w:bCs/>
+        </w:rPr>
+        <w:t xml:space="preserve"> </w:t>
+      </w:r>
+      <w:r>
+        <w:rPr>
+          <w:b/>
+          <w:bCs/>
+        </w:rPr>
+        <w:t>will cause errors</w:t>
+      </w:r>
+      <w:r>
+        <w:rPr>
+          <w:b/>
+          <w:bCs/>
+        </w:rPr>
+        <w:t>.</w:t>
+      </w:r>
+    </w:p>
+    <w:p>
+      <w:pPr>
+        <w:pStyle w:val="ListParagraph"/>
+        <w:numPr>
+          <w:ilvl w:val="1"/>
+          <w:numId w:val="1"/>
+        </w:numPr>
+        <w:rPr>
+          <w:b/>
+          <w:bCs/>
+        </w:rPr>
+      </w:pPr>
+      <w:r>
+        <w:t xml:space="preserve">Make sure to add your berries to the </w:t>
+      </w:r>
+      <w:proofErr w:type="spellStart"/>
+      <w:r>
+        <w:t>berry_dexes</w:t>
+      </w:r>
+      <w:proofErr w:type="spellEnd"/>
+      <w:r>
+        <w:t xml:space="preserve"> file in PBS so they will appear in the Dex!</w:t>
+      </w:r>
+    </w:p>
+    <w:p>
+      <w:pPr>
         <w:rPr>
           <w:b/>
           <w:bCs/>
@@ -11,8 +477,7 @@
           <w:szCs w:val="28"/>
           <w:u w:val="single"/>
         </w:rPr>
-        <w:t xml:space="preserve">Basic </w:t>
-      </w:r>
+      </w:pPr>
       <w:r>
         <w:rPr>
           <w:b/>
@@ -21,367 +486,6 @@
           <w:szCs w:val="28"/>
           <w:u w:val="single"/>
         </w:rPr>
-        <w:t>Setup</w:t>
-      </w:r>
-    </w:p>
-    <w:p>
-      <w:pPr>
-        <w:pStyle w:val="ListParagraph"/>
-        <w:numPr>
-          <w:ilvl w:val="0"/>
-          <w:numId w:val="1"/>
-        </w:numPr>
-      </w:pPr>
-      <w:r>
-        <w:rPr>
-          <w:b/>
-          <w:bCs/>
-        </w:rPr>
-        <w:t xml:space="preserve">Create a backup of your project. </w:t>
-      </w:r>
-      <w:r>
-        <w:t>I’m 96% sure nothing in my plugin will break your project, but it never hurts to back it up</w:t>
-      </w:r>
-      <w:r>
-        <w:t xml:space="preserve"> before installing </w:t>
-      </w:r>
-      <w:r>
-        <w:t xml:space="preserve">a new </w:t>
-      </w:r>
-      <w:r>
-        <w:t>plugin</w:t>
-      </w:r>
-      <w:r>
-        <w:t>.</w:t>
-      </w:r>
-    </w:p>
-    <w:p>
-      <w:pPr>
-        <w:pStyle w:val="ListParagraph"/>
-        <w:numPr>
-          <w:ilvl w:val="0"/>
-          <w:numId w:val="1"/>
-        </w:numPr>
-      </w:pPr>
-      <w:r>
-        <w:t xml:space="preserve">Install the </w:t>
-      </w:r>
-      <w:r>
-        <w:t>TDW Berry Core and Dex</w:t>
-      </w:r>
-      <w:r>
-        <w:t xml:space="preserve"> </w:t>
-      </w:r>
-      <w:r>
-        <w:t>plugin</w:t>
-      </w:r>
-      <w:r>
-        <w:t xml:space="preserve"> by copying </w:t>
-      </w:r>
-      <w:r>
-        <w:t>it</w:t>
-      </w:r>
-      <w:r>
-        <w:t xml:space="preserve"> into your project’s Plugins folder.</w:t>
-      </w:r>
-    </w:p>
-    <w:p>
-      <w:pPr>
-        <w:pStyle w:val="ListParagraph"/>
-        <w:numPr>
-          <w:ilvl w:val="0"/>
-          <w:numId w:val="1"/>
-        </w:numPr>
-      </w:pPr>
-      <w:r>
-        <w:t xml:space="preserve">Move the files in the Graphics and PBS folders </w:t>
-      </w:r>
-      <w:r>
-        <w:t>included</w:t>
-      </w:r>
-      <w:r>
-        <w:t xml:space="preserve"> into the same respective folders in your project.</w:t>
-      </w:r>
-    </w:p>
-    <w:p>
-      <w:pPr>
-        <w:pStyle w:val="ListParagraph"/>
-        <w:numPr>
-          <w:ilvl w:val="0"/>
-          <w:numId w:val="1"/>
-        </w:numPr>
-      </w:pPr>
-      <w:r>
-        <w:t xml:space="preserve">Explore the settings in </w:t>
-      </w:r>
-      <w:r>
-        <w:t xml:space="preserve">Plugins &gt; </w:t>
-      </w:r>
-      <w:r>
-        <w:t>TDW Berry Core and Dex</w:t>
-      </w:r>
-      <w:r>
-        <w:t xml:space="preserve"> &gt; </w:t>
-      </w:r>
-      <w:r>
-        <w:t>000_Settings</w:t>
-      </w:r>
-      <w:r>
-        <w:t>.</w:t>
-      </w:r>
-    </w:p>
-    <w:p>
-      <w:pPr>
-        <w:pStyle w:val="ListParagraph"/>
-        <w:numPr>
-          <w:ilvl w:val="0"/>
-          <w:numId w:val="1"/>
-        </w:numPr>
-      </w:pPr>
-      <w:r>
-        <w:t xml:space="preserve">Edit the </w:t>
-      </w:r>
-      <w:proofErr w:type="spellStart"/>
-      <w:r>
-        <w:t>berry_dexes</w:t>
-      </w:r>
-      <w:proofErr w:type="spellEnd"/>
-      <w:r>
-        <w:t xml:space="preserve"> file in PBS as you wish for your game. Similar to setting up a </w:t>
-      </w:r>
-      <w:proofErr w:type="spellStart"/>
-      <w:r>
-        <w:t>Pokedex</w:t>
-      </w:r>
-      <w:proofErr w:type="spellEnd"/>
-      <w:r>
-        <w:t xml:space="preserve">, define the list and order Berries will appear. Currently, only the [0] </w:t>
-      </w:r>
-      <w:proofErr w:type="spellStart"/>
-      <w:r>
-        <w:t>dex</w:t>
-      </w:r>
-      <w:proofErr w:type="spellEnd"/>
-      <w:r>
-        <w:t xml:space="preserve"> will be respected, but multiple </w:t>
-      </w:r>
-      <w:proofErr w:type="spellStart"/>
-      <w:r>
-        <w:t>Berrydexes</w:t>
-      </w:r>
-      <w:proofErr w:type="spellEnd"/>
-      <w:r>
-        <w:t xml:space="preserve"> may be supported in the future.</w:t>
-      </w:r>
-    </w:p>
-    <w:p>
-      <w:pPr>
-        <w:pStyle w:val="ListParagraph"/>
-        <w:numPr>
-          <w:ilvl w:val="0"/>
-          <w:numId w:val="1"/>
-        </w:numPr>
-      </w:pPr>
-      <w:r>
-        <w:t xml:space="preserve">Edit the </w:t>
-      </w:r>
-      <w:proofErr w:type="spellStart"/>
-      <w:r>
-        <w:t>berry_data</w:t>
-      </w:r>
-      <w:proofErr w:type="spellEnd"/>
-      <w:r>
-        <w:t xml:space="preserve"> file in PBS as you wish for your game.</w:t>
-      </w:r>
-    </w:p>
-    <w:p>
-      <w:pPr>
-        <w:pStyle w:val="ListParagraph"/>
-        <w:numPr>
-          <w:ilvl w:val="1"/>
-          <w:numId w:val="1"/>
-        </w:numPr>
-      </w:pPr>
-      <w:r>
-        <w:t xml:space="preserve">By default, the item description for the berry will show </w:t>
-      </w:r>
-      <w:r>
-        <w:t xml:space="preserve">in the Battle page of the </w:t>
-      </w:r>
-      <w:proofErr w:type="spellStart"/>
-      <w:r>
-        <w:t>Berrydex</w:t>
-      </w:r>
-      <w:proofErr w:type="spellEnd"/>
-      <w:r>
-        <w:t xml:space="preserve">. However, not all descriptions would fit this. You can customize what description to show here by including a </w:t>
-      </w:r>
-      <w:proofErr w:type="spellStart"/>
-      <w:r>
-        <w:t>BattleDescription</w:t>
-      </w:r>
-      <w:proofErr w:type="spellEnd"/>
-      <w:r>
-        <w:t xml:space="preserve"> </w:t>
-      </w:r>
-      <w:r>
-        <w:t xml:space="preserve">line </w:t>
-      </w:r>
-      <w:r>
-        <w:t xml:space="preserve">for the berry in the </w:t>
-      </w:r>
-      <w:proofErr w:type="spellStart"/>
-      <w:r>
-        <w:t>berry_data</w:t>
-      </w:r>
-      <w:proofErr w:type="spellEnd"/>
-      <w:r>
-        <w:t xml:space="preserve"> file</w:t>
-      </w:r>
-      <w:r>
-        <w:t xml:space="preserve"> to show that, instead.</w:t>
-      </w:r>
-    </w:p>
-    <w:p>
-      <w:pPr>
-        <w:pStyle w:val="ListParagraph"/>
-        <w:numPr>
-          <w:ilvl w:val="0"/>
-          <w:numId w:val="1"/>
-        </w:numPr>
-        <w:rPr>
-          <w:b/>
-          <w:bCs/>
-        </w:rPr>
-      </w:pPr>
-      <w:r>
-        <w:rPr>
-          <w:b/>
-          <w:bCs/>
-        </w:rPr>
-        <w:t>If you have custom Berries...</w:t>
-      </w:r>
-    </w:p>
-    <w:p>
-      <w:pPr>
-        <w:pStyle w:val="ListParagraph"/>
-        <w:numPr>
-          <w:ilvl w:val="1"/>
-          <w:numId w:val="1"/>
-        </w:numPr>
-      </w:pPr>
-      <w:r>
-        <w:t xml:space="preserve">Open the </w:t>
-      </w:r>
-      <w:proofErr w:type="spellStart"/>
-      <w:r>
-        <w:t>berry_data</w:t>
-      </w:r>
-      <w:proofErr w:type="spellEnd"/>
-      <w:r>
-        <w:t xml:space="preserve"> file in PBS.</w:t>
-      </w:r>
-    </w:p>
-    <w:p>
-      <w:pPr>
-        <w:pStyle w:val="ListParagraph"/>
-        <w:numPr>
-          <w:ilvl w:val="1"/>
-          <w:numId w:val="1"/>
-        </w:numPr>
-        <w:rPr>
-          <w:b/>
-          <w:bCs/>
-        </w:rPr>
-      </w:pPr>
-      <w:r>
-        <w:t xml:space="preserve">Define each of your custom berries. </w:t>
-      </w:r>
-      <w:r>
-        <w:rPr>
-          <w:b/>
-          <w:bCs/>
-        </w:rPr>
-        <w:t xml:space="preserve">Without setting this up, using your custom berries </w:t>
-      </w:r>
-      <w:r>
-        <w:rPr>
-          <w:b/>
-          <w:bCs/>
-        </w:rPr>
-        <w:t xml:space="preserve">for </w:t>
-      </w:r>
-      <w:r>
-        <w:rPr>
-          <w:b/>
-          <w:bCs/>
-        </w:rPr>
-        <w:t>some features</w:t>
-      </w:r>
-      <w:r>
-        <w:rPr>
-          <w:b/>
-          <w:bCs/>
-        </w:rPr>
-        <w:t xml:space="preserve"> </w:t>
-      </w:r>
-      <w:r>
-        <w:rPr>
-          <w:b/>
-          <w:bCs/>
-        </w:rPr>
-        <w:t>will cause errors</w:t>
-      </w:r>
-      <w:r>
-        <w:rPr>
-          <w:b/>
-          <w:bCs/>
-        </w:rPr>
-        <w:t>.</w:t>
-      </w:r>
-    </w:p>
-    <w:p>
-      <w:pPr>
-        <w:pStyle w:val="ListParagraph"/>
-        <w:numPr>
-          <w:ilvl w:val="1"/>
-          <w:numId w:val="1"/>
-        </w:numPr>
-        <w:rPr>
-          <w:b/>
-          <w:bCs/>
-        </w:rPr>
-      </w:pPr>
-      <w:r>
-        <w:t xml:space="preserve">Make sure to add your berries to the </w:t>
-      </w:r>
-      <w:proofErr w:type="spellStart"/>
-      <w:r>
-        <w:t>berry_dexes</w:t>
-      </w:r>
-      <w:proofErr w:type="spellEnd"/>
-      <w:r>
-        <w:t xml:space="preserve"> file in PBS so they will appear in the Dex!</w:t>
-      </w:r>
-    </w:p>
-    <w:p>
-      <w:pPr>
-        <w:rPr>
-          <w:b/>
-          <w:bCs/>
-          <w:sz w:val="28"/>
-          <w:szCs w:val="28"/>
-          <w:u w:val="single"/>
-        </w:rPr>
-      </w:pPr>
-      <w:r>
-        <w:rPr>
-          <w:b/>
-          <w:bCs/>
-          <w:sz w:val="28"/>
-          <w:szCs w:val="28"/>
-          <w:u w:val="single"/>
-        </w:rPr>
         <w:t>Documentation</w:t>
       </w:r>
     </w:p>
@@ -1298,10 +1402,23 @@
           <w:sz w:val="20"/>
           <w:szCs w:val="20"/>
         </w:rPr>
-        <w:t>:ORANBERRY)</w:t>
-      </w:r>
-      <w:r>
-        <w:t xml:space="preserve">=&gt; </w:t>
+        <w:t>:</w:t>
+      </w:r>
+      <w:proofErr w:type="gramStart"/>
+      <w:r>
+        <w:rPr>
+          <w:rFonts w:ascii="Source Code Pro" w:hAnsi="Source Code Pro"/>
+          <w:sz w:val="20"/>
+          <w:szCs w:val="20"/>
+        </w:rPr>
+        <w:t>ORANBERRY)</w:t>
+      </w:r>
+      <w:r>
+        <w:t>=</w:t>
+      </w:r>
+      <w:proofErr w:type="gramEnd"/>
+      <w:r>
+        <w:t xml:space="preserve">&gt; </w:t>
       </w:r>
       <w:r>
         <w:t xml:space="preserve">Returns </w:t>
@@ -1616,14 +1733,119 @@
         </w:rPr>
         <w:t>(</w:t>
       </w:r>
+      <w:r>
+        <w:rPr>
+          <w:rFonts w:ascii="Source Code Pro" w:hAnsi="Source Code Pro"/>
+          <w:sz w:val="20"/>
+          <w:szCs w:val="20"/>
+        </w:rPr>
+        <w:t>15</w:t>
+      </w:r>
+      <w:r>
+        <w:rPr>
+          <w:rFonts w:ascii="Source Code Pro" w:hAnsi="Source Code Pro"/>
+          <w:sz w:val="20"/>
+          <w:szCs w:val="20"/>
+        </w:rPr>
+        <w:t>)</w:t>
+      </w:r>
+      <w:r>
+        <w:t>=</w:t>
+      </w:r>
       <w:proofErr w:type="gramEnd"/>
       <w:r>
-        <w:rPr>
-          <w:rFonts w:ascii="Source Code Pro" w:hAnsi="Source Code Pro"/>
-          <w:sz w:val="20"/>
-          <w:szCs w:val="20"/>
-        </w:rPr>
-        <w:t>15</w:t>
+        <w:t xml:space="preserve">&gt; </w:t>
+      </w:r>
+      <w:r>
+        <w:t>Opens an item selection scene for the player to choose a Berry. The choice is saved in Variable 15.</w:t>
+      </w:r>
+    </w:p>
+    <w:p>
+      <w:pPr>
+        <w:rPr>
+          <w:rFonts w:ascii="Source Code Pro" w:hAnsi="Source Code Pro"/>
+          <w:sz w:val="20"/>
+          <w:szCs w:val="20"/>
+        </w:rPr>
+      </w:pPr>
+    </w:p>
+    <w:p>
+      <w:pPr>
+        <w:rPr>
+          <w:rFonts w:ascii="Source Code Pro" w:hAnsi="Source Code Pro"/>
+          <w:sz w:val="20"/>
+          <w:szCs w:val="20"/>
+        </w:rPr>
+      </w:pPr>
+      <w:proofErr w:type="spellStart"/>
+      <w:proofErr w:type="gramStart"/>
+      <w:r>
+        <w:rPr>
+          <w:rFonts w:ascii="Source Code Pro" w:hAnsi="Source Code Pro"/>
+          <w:sz w:val="20"/>
+          <w:szCs w:val="20"/>
+        </w:rPr>
+        <w:t>pbChooseBerryMultiple</w:t>
+      </w:r>
+      <w:proofErr w:type="spellEnd"/>
+      <w:r>
+        <w:rPr>
+          <w:rFonts w:ascii="Source Code Pro" w:hAnsi="Source Code Pro"/>
+          <w:sz w:val="20"/>
+          <w:szCs w:val="20"/>
+        </w:rPr>
+        <w:t>(</w:t>
+      </w:r>
+      <w:proofErr w:type="gramEnd"/>
+      <w:r>
+        <w:rPr>
+          <w:rFonts w:ascii="Source Code Pro" w:hAnsi="Source Code Pro"/>
+          <w:sz w:val="20"/>
+          <w:szCs w:val="20"/>
+        </w:rPr>
+        <w:t>Count</w:t>
+      </w:r>
+      <w:r>
+        <w:rPr>
+          <w:rFonts w:ascii="Source Code Pro" w:hAnsi="Source Code Pro"/>
+          <w:sz w:val="20"/>
+          <w:szCs w:val="20"/>
+        </w:rPr>
+        <w:t xml:space="preserve">, </w:t>
+      </w:r>
+      <w:proofErr w:type="spellStart"/>
+      <w:r>
+        <w:rPr>
+          <w:rFonts w:ascii="Source Code Pro" w:hAnsi="Source Code Pro"/>
+          <w:sz w:val="20"/>
+          <w:szCs w:val="20"/>
+        </w:rPr>
+        <w:t>AllowLess</w:t>
+      </w:r>
+      <w:proofErr w:type="spellEnd"/>
+      <w:r>
+        <w:rPr>
+          <w:rFonts w:ascii="Source Code Pro" w:hAnsi="Source Code Pro"/>
+          <w:sz w:val="20"/>
+          <w:szCs w:val="20"/>
+        </w:rPr>
+        <w:t xml:space="preserve">, </w:t>
+      </w:r>
+      <w:r>
+        <w:rPr>
+          <w:rFonts w:ascii="Source Code Pro" w:hAnsi="Source Code Pro"/>
+          <w:sz w:val="20"/>
+          <w:szCs w:val="20"/>
+        </w:rPr>
+        <w:t>Remove</w:t>
+      </w:r>
+      <w:r>
+        <w:rPr>
+          <w:rFonts w:ascii="Source Code Pro" w:hAnsi="Source Code Pro"/>
+          <w:sz w:val="20"/>
+          <w:szCs w:val="20"/>
+        </w:rPr>
+        <w:t>, Label</w:t>
       </w:r>
       <w:r>
         <w:rPr>
@@ -1633,143 +1855,329 @@
         </w:rPr>
         <w:t>)</w:t>
       </w:r>
+    </w:p>
+    <w:p>
+      <w:pPr>
+        <w:pStyle w:val="ListParagraph"/>
+        <w:numPr>
+          <w:ilvl w:val="0"/>
+          <w:numId w:val="2"/>
+        </w:numPr>
+      </w:pPr>
+      <w:r>
+        <w:t>Description: A custom scene that allows the player to select multiple Berries at one time. Returns an array of the Berry IDs chosen.</w:t>
+      </w:r>
+    </w:p>
+    <w:p>
+      <w:pPr>
+        <w:pStyle w:val="ListParagraph"/>
+        <w:numPr>
+          <w:ilvl w:val="0"/>
+          <w:numId w:val="2"/>
+        </w:numPr>
+      </w:pPr>
+      <w:r>
+        <w:t>Arguments:</w:t>
+      </w:r>
+    </w:p>
+    <w:p>
+      <w:pPr>
+        <w:pStyle w:val="ListParagraph"/>
+        <w:numPr>
+          <w:ilvl w:val="1"/>
+          <w:numId w:val="2"/>
+        </w:numPr>
+      </w:pPr>
+      <w:r>
+        <w:t>Count</w:t>
+      </w:r>
+    </w:p>
+    <w:p>
+      <w:pPr>
+        <w:pStyle w:val="ListParagraph"/>
+        <w:numPr>
+          <w:ilvl w:val="2"/>
+          <w:numId w:val="2"/>
+        </w:numPr>
+      </w:pPr>
+      <w:r>
+        <w:t>Optional. An integer for the max number of Berries the player can select. The max that can be selected at once is 6.</w:t>
+      </w:r>
+    </w:p>
+    <w:p>
+      <w:pPr>
+        <w:pStyle w:val="ListParagraph"/>
+        <w:numPr>
+          <w:ilvl w:val="2"/>
+          <w:numId w:val="2"/>
+        </w:numPr>
+      </w:pPr>
+      <w:r>
+        <w:t>If this isn’t set, the default is 2.</w:t>
+      </w:r>
+    </w:p>
+    <w:p>
+      <w:pPr>
+        <w:pStyle w:val="ListParagraph"/>
+        <w:numPr>
+          <w:ilvl w:val="1"/>
+          <w:numId w:val="2"/>
+        </w:numPr>
+      </w:pPr>
+      <w:proofErr w:type="spellStart"/>
+      <w:r>
+        <w:t>AllowLess</w:t>
+      </w:r>
+      <w:proofErr w:type="spellEnd"/>
+    </w:p>
+    <w:p>
+      <w:pPr>
+        <w:pStyle w:val="ListParagraph"/>
+        <w:numPr>
+          <w:ilvl w:val="2"/>
+          <w:numId w:val="2"/>
+        </w:numPr>
+      </w:pPr>
+      <w:r>
+        <w:t>Optional. Set to true or false depending on if you want to allow the player to choose less than the number set in Count.</w:t>
+      </w:r>
+    </w:p>
+    <w:p>
+      <w:pPr>
+        <w:pStyle w:val="ListParagraph"/>
+        <w:numPr>
+          <w:ilvl w:val="2"/>
+          <w:numId w:val="2"/>
+        </w:numPr>
+      </w:pPr>
+      <w:r>
+        <w:t>If this isn’t set, the player will be allowed to choose less than Count.</w:t>
+      </w:r>
+    </w:p>
+    <w:p>
+      <w:pPr>
+        <w:pStyle w:val="ListParagraph"/>
+        <w:numPr>
+          <w:ilvl w:val="1"/>
+          <w:numId w:val="2"/>
+        </w:numPr>
+      </w:pPr>
+      <w:r>
+        <w:t>Remove</w:t>
+      </w:r>
+    </w:p>
+    <w:p>
+      <w:pPr>
+        <w:pStyle w:val="ListParagraph"/>
+        <w:numPr>
+          <w:ilvl w:val="2"/>
+          <w:numId w:val="2"/>
+        </w:numPr>
+      </w:pPr>
+      <w:r>
+        <w:t>Optional. Set to true or false depending on if you want the Berries the player chooses to be removed from the bag after the function is called.</w:t>
+      </w:r>
+    </w:p>
+    <w:p>
+      <w:pPr>
+        <w:pStyle w:val="ListParagraph"/>
+        <w:numPr>
+          <w:ilvl w:val="2"/>
+          <w:numId w:val="2"/>
+        </w:numPr>
+      </w:pPr>
+      <w:r>
+        <w:t>If this isn’t set, chosen Berries will be removed by default.</w:t>
+      </w:r>
+    </w:p>
+    <w:p>
+      <w:pPr>
+        <w:pStyle w:val="ListParagraph"/>
+        <w:numPr>
+          <w:ilvl w:val="1"/>
+          <w:numId w:val="2"/>
+        </w:numPr>
+      </w:pPr>
+      <w:r>
+        <w:t>Label</w:t>
+      </w:r>
+    </w:p>
+    <w:p>
+      <w:pPr>
+        <w:pStyle w:val="ListParagraph"/>
+        <w:numPr>
+          <w:ilvl w:val="2"/>
+          <w:numId w:val="2"/>
+        </w:numPr>
+      </w:pPr>
+      <w:r>
+        <w:t xml:space="preserve">Optional. Set to </w:t>
+      </w:r>
+      <w:r>
+        <w:t>one of the following to show that data as the label</w:t>
+      </w:r>
+      <w:r>
+        <w:t xml:space="preserve"> </w:t>
+      </w:r>
+      <w:r>
+        <w:t>when selecting a Berry.</w:t>
+      </w:r>
+    </w:p>
+    <w:p>
+      <w:pPr>
+        <w:pStyle w:val="ListParagraph"/>
+        <w:numPr>
+          <w:ilvl w:val="3"/>
+          <w:numId w:val="2"/>
+        </w:numPr>
+      </w:pPr>
+      <w:proofErr w:type="gramStart"/>
+      <w:r>
+        <w:t>:Color</w:t>
+      </w:r>
+      <w:proofErr w:type="gramEnd"/>
+      <w:r>
+        <w:t xml:space="preserve"> </w:t>
+      </w:r>
       <w:r>
         <w:t xml:space="preserve">=&gt; </w:t>
       </w:r>
       <w:r>
-        <w:t>Opens an item selection scene for the player to choose a Berry. The choice is saved in Variable 15.</w:t>
-      </w:r>
-    </w:p>
-    <w:p>
-      <w:pPr>
-        <w:rPr>
-          <w:rFonts w:ascii="Source Code Pro" w:hAnsi="Source Code Pro"/>
-          <w:sz w:val="20"/>
-          <w:szCs w:val="20"/>
-        </w:rPr>
-      </w:pPr>
-    </w:p>
-    <w:p>
-      <w:pPr>
-        <w:rPr>
-          <w:rFonts w:ascii="Source Code Pro" w:hAnsi="Source Code Pro"/>
-          <w:sz w:val="20"/>
-          <w:szCs w:val="20"/>
-        </w:rPr>
-      </w:pPr>
-      <w:proofErr w:type="spellStart"/>
+        <w:t>show the Berry’s color</w:t>
+      </w:r>
+    </w:p>
+    <w:p>
+      <w:pPr>
+        <w:pStyle w:val="ListParagraph"/>
+        <w:numPr>
+          <w:ilvl w:val="3"/>
+          <w:numId w:val="2"/>
+        </w:numPr>
+      </w:pPr>
       <w:proofErr w:type="gramStart"/>
       <w:r>
-        <w:rPr>
-          <w:rFonts w:ascii="Source Code Pro" w:hAnsi="Source Code Pro"/>
-          <w:sz w:val="20"/>
-          <w:szCs w:val="20"/>
-        </w:rPr>
-        <w:t>pbChooseBerryMultiple</w:t>
-      </w:r>
-      <w:proofErr w:type="spellEnd"/>
-      <w:r>
-        <w:rPr>
-          <w:rFonts w:ascii="Source Code Pro" w:hAnsi="Source Code Pro"/>
-          <w:sz w:val="20"/>
-          <w:szCs w:val="20"/>
-        </w:rPr>
-        <w:t>(</w:t>
+        <w:t>:Type</w:t>
       </w:r>
       <w:proofErr w:type="gramEnd"/>
       <w:r>
-        <w:rPr>
-          <w:rFonts w:ascii="Source Code Pro" w:hAnsi="Source Code Pro"/>
-          <w:sz w:val="20"/>
-          <w:szCs w:val="20"/>
-        </w:rPr>
-        <w:t>Count</w:t>
-      </w:r>
-      <w:r>
-        <w:rPr>
-          <w:rFonts w:ascii="Source Code Pro" w:hAnsi="Source Code Pro"/>
-          <w:sz w:val="20"/>
-          <w:szCs w:val="20"/>
-        </w:rPr>
-        <w:t xml:space="preserve">, </w:t>
-      </w:r>
-      <w:proofErr w:type="spellStart"/>
-      <w:r>
-        <w:rPr>
-          <w:rFonts w:ascii="Source Code Pro" w:hAnsi="Source Code Pro"/>
-          <w:sz w:val="20"/>
-          <w:szCs w:val="20"/>
-        </w:rPr>
-        <w:t>AllowLess</w:t>
-      </w:r>
-      <w:proofErr w:type="spellEnd"/>
-      <w:r>
-        <w:rPr>
-          <w:rFonts w:ascii="Source Code Pro" w:hAnsi="Source Code Pro"/>
-          <w:sz w:val="20"/>
-          <w:szCs w:val="20"/>
-        </w:rPr>
-        <w:t xml:space="preserve">, </w:t>
-      </w:r>
-      <w:r>
-        <w:rPr>
-          <w:rFonts w:ascii="Source Code Pro" w:hAnsi="Source Code Pro"/>
-          <w:sz w:val="20"/>
-          <w:szCs w:val="20"/>
-        </w:rPr>
-        <w:t>Remove</w:t>
-      </w:r>
-      <w:r>
-        <w:rPr>
-          <w:rFonts w:ascii="Source Code Pro" w:hAnsi="Source Code Pro"/>
-          <w:sz w:val="20"/>
-          <w:szCs w:val="20"/>
-        </w:rPr>
-        <w:t>, Label</w:t>
-      </w:r>
-      <w:r>
-        <w:rPr>
-          <w:rFonts w:ascii="Source Code Pro" w:hAnsi="Source Code Pro"/>
-          <w:sz w:val="20"/>
-          <w:szCs w:val="20"/>
-        </w:rPr>
-        <w:t>)</w:t>
-      </w:r>
-    </w:p>
-    <w:p>
-      <w:pPr>
-        <w:pStyle w:val="ListParagraph"/>
-        <w:numPr>
-          <w:ilvl w:val="0"/>
-          <w:numId w:val="2"/>
-        </w:numPr>
-      </w:pPr>
-      <w:r>
-        <w:t>Description: A custom scene that allows the player to select multiple Berries at one time. Returns an array of the Berry IDs chosen.</w:t>
-      </w:r>
-    </w:p>
-    <w:p>
-      <w:pPr>
-        <w:pStyle w:val="ListParagraph"/>
-        <w:numPr>
-          <w:ilvl w:val="0"/>
-          <w:numId w:val="2"/>
-        </w:numPr>
-      </w:pPr>
-      <w:r>
-        <w:t>Arguments:</w:t>
-      </w:r>
-    </w:p>
-    <w:p>
-      <w:pPr>
-        <w:pStyle w:val="ListParagraph"/>
-        <w:numPr>
-          <w:ilvl w:val="1"/>
-          <w:numId w:val="2"/>
-        </w:numPr>
-      </w:pPr>
-      <w:r>
-        <w:t>Count</w:t>
+        <w:t xml:space="preserve"> </w:t>
+      </w:r>
+      <w:proofErr w:type="gramStart"/>
+      <w:r>
+        <w:t>or :</w:t>
+      </w:r>
+      <w:proofErr w:type="spellStart"/>
+      <w:r>
+        <w:t>TypeText</w:t>
+      </w:r>
+      <w:proofErr w:type="spellEnd"/>
+      <w:proofErr w:type="gramEnd"/>
+      <w:r>
+        <w:t xml:space="preserve"> =&gt;</w:t>
+      </w:r>
+      <w:r>
+        <w:t xml:space="preserve"> show the Berry’s Natural Gift move type</w:t>
+      </w:r>
+      <w:r>
+        <w:t xml:space="preserve"> as text</w:t>
+      </w:r>
+      <w:r>
+        <w:t>.</w:t>
+      </w:r>
+    </w:p>
+    <w:p>
+      <w:pPr>
+        <w:pStyle w:val="ListParagraph"/>
+        <w:numPr>
+          <w:ilvl w:val="3"/>
+          <w:numId w:val="2"/>
+        </w:numPr>
+      </w:pPr>
+      <w:proofErr w:type="gramStart"/>
+      <w:r>
+        <w:t>:</w:t>
+      </w:r>
+      <w:proofErr w:type="spellStart"/>
+      <w:r>
+        <w:t>TypeIcon</w:t>
+      </w:r>
+      <w:proofErr w:type="spellEnd"/>
+      <w:proofErr w:type="gramEnd"/>
+      <w:r>
+        <w:t xml:space="preserve"> </w:t>
+      </w:r>
+      <w:r>
+        <w:t xml:space="preserve">=&gt; </w:t>
+      </w:r>
+      <w:r>
+        <w:t>show the Berry’s Natural Gift move type as an icon.</w:t>
+      </w:r>
+    </w:p>
+    <w:p>
+      <w:pPr>
+        <w:pStyle w:val="ListParagraph"/>
+        <w:numPr>
+          <w:ilvl w:val="3"/>
+          <w:numId w:val="2"/>
+        </w:numPr>
+      </w:pPr>
+      <w:proofErr w:type="gramStart"/>
+      <w:r>
+        <w:t>:Size</w:t>
+      </w:r>
+      <w:proofErr w:type="gramEnd"/>
+      <w:r>
+        <w:t xml:space="preserve"> =&gt; show the Berry’s size.</w:t>
+      </w:r>
+    </w:p>
+    <w:p>
+      <w:pPr>
+        <w:pStyle w:val="ListParagraph"/>
+        <w:numPr>
+          <w:ilvl w:val="3"/>
+          <w:numId w:val="2"/>
+        </w:numPr>
+      </w:pPr>
+      <w:proofErr w:type="gramStart"/>
+      <w:r>
+        <w:t>:Firm</w:t>
+      </w:r>
+      <w:proofErr w:type="gramEnd"/>
+      <w:r>
+        <w:t xml:space="preserve"> </w:t>
+      </w:r>
+      <w:proofErr w:type="gramStart"/>
+      <w:r>
+        <w:t>or :Firmness</w:t>
+      </w:r>
+      <w:proofErr w:type="gramEnd"/>
+      <w:r>
+        <w:t xml:space="preserve"> =&gt; show </w:t>
+      </w:r>
+      <w:proofErr w:type="gramStart"/>
+      <w:r>
+        <w:t>the Berry’s</w:t>
+      </w:r>
+      <w:proofErr w:type="gramEnd"/>
+      <w:r>
+        <w:t xml:space="preserve"> firmness.</w:t>
+      </w:r>
+    </w:p>
+    <w:p>
+      <w:pPr>
+        <w:pStyle w:val="ListParagraph"/>
+        <w:numPr>
+          <w:ilvl w:val="3"/>
+          <w:numId w:val="2"/>
+        </w:numPr>
+      </w:pPr>
+      <w:proofErr w:type="gramStart"/>
+      <w:r>
+        <w:t>:Flavor</w:t>
+      </w:r>
+      <w:proofErr w:type="gramEnd"/>
+      <w:r>
+        <w:t xml:space="preserve"> =&gt; show the Berry’s highest valued flavor. If there is a tie, it will only say the first flavor of that highest value.</w:t>
       </w:r>
     </w:p>
     <w:p>
@@ -1781,336 +2189,15 @@
         </w:numPr>
       </w:pPr>
       <w:r>
-        <w:t>Optional. An integer for the max number of Berries the player can select. The max that can be selected at once is 6.</w:t>
-      </w:r>
-    </w:p>
-    <w:p>
-      <w:pPr>
-        <w:pStyle w:val="ListParagraph"/>
-        <w:numPr>
-          <w:ilvl w:val="2"/>
-          <w:numId w:val="2"/>
-        </w:numPr>
-      </w:pPr>
-      <w:r>
-        <w:t>If this isn’t set, the default is 2.</w:t>
-      </w:r>
-    </w:p>
-    <w:p>
-      <w:pPr>
-        <w:pStyle w:val="ListParagraph"/>
-        <w:numPr>
-          <w:ilvl w:val="1"/>
-          <w:numId w:val="2"/>
-        </w:numPr>
-      </w:pPr>
-      <w:proofErr w:type="spellStart"/>
-      <w:r>
-        <w:t>AllowLess</w:t>
-      </w:r>
-      <w:proofErr w:type="spellEnd"/>
-    </w:p>
-    <w:p>
-      <w:pPr>
-        <w:pStyle w:val="ListParagraph"/>
-        <w:numPr>
-          <w:ilvl w:val="2"/>
-          <w:numId w:val="2"/>
-        </w:numPr>
-      </w:pPr>
-      <w:r>
-        <w:t>Optional. Set to true or false depending on if you want to allow the player to choose less than the number set in Count.</w:t>
-      </w:r>
-    </w:p>
-    <w:p>
-      <w:pPr>
-        <w:pStyle w:val="ListParagraph"/>
-        <w:numPr>
-          <w:ilvl w:val="2"/>
-          <w:numId w:val="2"/>
-        </w:numPr>
-      </w:pPr>
-      <w:r>
-        <w:t>If this isn’t set, the player will be allowed to choose less than Count.</w:t>
-      </w:r>
-    </w:p>
-    <w:p>
-      <w:pPr>
-        <w:pStyle w:val="ListParagraph"/>
-        <w:numPr>
-          <w:ilvl w:val="1"/>
-          <w:numId w:val="2"/>
-        </w:numPr>
-      </w:pPr>
-      <w:r>
-        <w:t>Remove</w:t>
-      </w:r>
-    </w:p>
-    <w:p>
-      <w:pPr>
-        <w:pStyle w:val="ListParagraph"/>
-        <w:numPr>
-          <w:ilvl w:val="2"/>
-          <w:numId w:val="2"/>
-        </w:numPr>
-      </w:pPr>
-      <w:r>
-        <w:t>Optional. Set to true or false depending on if you want the Berries the player chooses to be removed from the bag after the function is called.</w:t>
-      </w:r>
-    </w:p>
-    <w:p>
-      <w:pPr>
-        <w:pStyle w:val="ListParagraph"/>
-        <w:numPr>
-          <w:ilvl w:val="2"/>
-          <w:numId w:val="2"/>
-        </w:numPr>
-      </w:pPr>
-      <w:r>
-        <w:t>If this isn’t set, chosen Berries will be removed by default.</w:t>
-      </w:r>
-    </w:p>
-    <w:p>
-      <w:pPr>
-        <w:pStyle w:val="ListParagraph"/>
-        <w:numPr>
-          <w:ilvl w:val="1"/>
-          <w:numId w:val="2"/>
-        </w:numPr>
-      </w:pPr>
-      <w:r>
-        <w:t>Label</w:t>
-      </w:r>
-    </w:p>
-    <w:p>
-      <w:pPr>
-        <w:pStyle w:val="ListParagraph"/>
-        <w:numPr>
-          <w:ilvl w:val="2"/>
-          <w:numId w:val="2"/>
-        </w:numPr>
-      </w:pPr>
-      <w:r>
-        <w:t xml:space="preserve">Optional. </w:t>
-      </w:r>
-      <w:r>
-        <w:t xml:space="preserve">Set to </w:t>
-      </w:r>
-      <w:r>
-        <w:t>one of the following to show that data as the label</w:t>
-      </w:r>
-      <w:r>
-        <w:t xml:space="preserve"> </w:t>
-      </w:r>
-      <w:r>
-        <w:t>when selecting a Berry.</w:t>
-      </w:r>
-    </w:p>
-    <w:p>
-      <w:pPr>
-        <w:pStyle w:val="ListParagraph"/>
-        <w:numPr>
-          <w:ilvl w:val="3"/>
-          <w:numId w:val="2"/>
-        </w:numPr>
-      </w:pPr>
+        <w:t>If this isn’t set</w:t>
+      </w:r>
       <w:proofErr w:type="gramStart"/>
       <w:r>
-        <w:t>:Color</w:t>
+        <w:t>, :Color</w:t>
       </w:r>
       <w:proofErr w:type="gramEnd"/>
       <w:r>
-        <w:t xml:space="preserve"> </w:t>
-      </w:r>
-      <w:r>
-        <w:t xml:space="preserve">=&gt; </w:t>
-      </w:r>
-      <w:r>
-        <w:t>show the Berry’s color</w:t>
-      </w:r>
-    </w:p>
-    <w:p>
-      <w:pPr>
-        <w:pStyle w:val="ListParagraph"/>
-        <w:numPr>
-          <w:ilvl w:val="3"/>
-          <w:numId w:val="2"/>
-        </w:numPr>
-      </w:pPr>
-      <w:proofErr w:type="gramStart"/>
-      <w:r>
-        <w:t>:Type</w:t>
-      </w:r>
-      <w:proofErr w:type="gramEnd"/>
-      <w:r>
-        <w:t xml:space="preserve"> </w:t>
-      </w:r>
-      <w:r>
-        <w:t>or :</w:t>
-      </w:r>
-      <w:proofErr w:type="spellStart"/>
-      <w:r>
-        <w:t>TypeText</w:t>
-      </w:r>
-      <w:proofErr w:type="spellEnd"/>
-      <w:r>
-        <w:t xml:space="preserve"> =&gt;</w:t>
-      </w:r>
-      <w:r>
-        <w:t xml:space="preserve"> show the Berry’s Natural Gift move type</w:t>
-      </w:r>
-      <w:r>
-        <w:t xml:space="preserve"> as text</w:t>
-      </w:r>
-      <w:r>
-        <w:t>.</w:t>
-      </w:r>
-    </w:p>
-    <w:p>
-      <w:pPr>
-        <w:pStyle w:val="ListParagraph"/>
-        <w:numPr>
-          <w:ilvl w:val="3"/>
-          <w:numId w:val="2"/>
-        </w:numPr>
-      </w:pPr>
-      <w:proofErr w:type="gramStart"/>
-      <w:r>
-        <w:t>:</w:t>
-      </w:r>
-      <w:proofErr w:type="spellStart"/>
-      <w:r>
-        <w:t>Type</w:t>
-      </w:r>
-      <w:r>
-        <w:t>Icon</w:t>
-      </w:r>
-      <w:proofErr w:type="spellEnd"/>
-      <w:proofErr w:type="gramEnd"/>
-      <w:r>
-        <w:t xml:space="preserve"> </w:t>
-      </w:r>
-      <w:r>
-        <w:t xml:space="preserve">=&gt; </w:t>
-      </w:r>
-      <w:r>
-        <w:t>show the Berry’s Natural Gift move type</w:t>
-      </w:r>
-      <w:r>
-        <w:t xml:space="preserve"> as an icon</w:t>
-      </w:r>
-      <w:r>
-        <w:t>.</w:t>
-      </w:r>
-    </w:p>
-    <w:p>
-      <w:pPr>
-        <w:pStyle w:val="ListParagraph"/>
-        <w:numPr>
-          <w:ilvl w:val="3"/>
-          <w:numId w:val="2"/>
-        </w:numPr>
-      </w:pPr>
-      <w:proofErr w:type="gramStart"/>
-      <w:r>
-        <w:t>:</w:t>
-      </w:r>
-      <w:r>
-        <w:t>Size</w:t>
-      </w:r>
-      <w:proofErr w:type="gramEnd"/>
-      <w:r>
-        <w:t xml:space="preserve"> =&gt; show the Berry’s </w:t>
-      </w:r>
-      <w:r>
-        <w:t>size</w:t>
-      </w:r>
-      <w:r>
-        <w:t>.</w:t>
-      </w:r>
-    </w:p>
-    <w:p>
-      <w:pPr>
-        <w:pStyle w:val="ListParagraph"/>
-        <w:numPr>
-          <w:ilvl w:val="3"/>
-          <w:numId w:val="2"/>
-        </w:numPr>
-      </w:pPr>
-      <w:proofErr w:type="gramStart"/>
-      <w:r>
-        <w:t>:</w:t>
-      </w:r>
-      <w:r>
-        <w:t>Firm</w:t>
-      </w:r>
-      <w:proofErr w:type="gramEnd"/>
-      <w:r>
-        <w:t xml:space="preserve"> or :Firmness =&gt;</w:t>
-      </w:r>
-      <w:r>
-        <w:t xml:space="preserve"> show the Berry’s </w:t>
-      </w:r>
-      <w:r>
-        <w:t>firmness</w:t>
-      </w:r>
-      <w:r>
-        <w:t>.</w:t>
-      </w:r>
-    </w:p>
-    <w:p>
-      <w:pPr>
-        <w:pStyle w:val="ListParagraph"/>
-        <w:numPr>
-          <w:ilvl w:val="3"/>
-          <w:numId w:val="2"/>
-        </w:numPr>
-      </w:pPr>
-      <w:proofErr w:type="gramStart"/>
-      <w:r>
-        <w:t>:</w:t>
-      </w:r>
-      <w:r>
-        <w:t>Flavor</w:t>
-      </w:r>
-      <w:proofErr w:type="gramEnd"/>
-      <w:r>
-        <w:t xml:space="preserve"> =&gt; show the Berry’s </w:t>
-      </w:r>
-      <w:r>
-        <w:t>highest valued flavor</w:t>
-      </w:r>
-      <w:r>
-        <w:t>.</w:t>
-      </w:r>
-      <w:r>
-        <w:t xml:space="preserve"> If there is a tie, it will only say the first flavor of that highest value.</w:t>
-      </w:r>
-    </w:p>
-    <w:p>
-      <w:pPr>
-        <w:pStyle w:val="ListParagraph"/>
-        <w:numPr>
-          <w:ilvl w:val="2"/>
-          <w:numId w:val="2"/>
-        </w:numPr>
-      </w:pPr>
-      <w:r>
-        <w:t>If this isn’t set</w:t>
-      </w:r>
-      <w:proofErr w:type="gramStart"/>
-      <w:r>
-        <w:t xml:space="preserve">, </w:t>
-      </w:r>
-      <w:r>
-        <w:t>:Color</w:t>
-      </w:r>
-      <w:proofErr w:type="gramEnd"/>
-      <w:r>
-        <w:t xml:space="preserve"> is used</w:t>
-      </w:r>
-      <w:r>
-        <w:t>.</w:t>
+        <w:t xml:space="preserve"> is used.</w:t>
       </w:r>
     </w:p>
     <w:p>
@@ -2286,24 +2373,18 @@
           <w:sz w:val="20"/>
           <w:szCs w:val="20"/>
         </w:rPr>
-        <w:t>4</w:t>
-      </w:r>
-      <w:r>
-        <w:rPr>
-          <w:rFonts w:ascii="Source Code Pro" w:hAnsi="Source Code Pro"/>
-          <w:sz w:val="20"/>
-          <w:szCs w:val="20"/>
-        </w:rPr>
-        <w:t xml:space="preserve">, false, </w:t>
-      </w:r>
-      <w:r>
-        <w:rPr>
-          <w:rFonts w:ascii="Source Code Pro" w:hAnsi="Source Code Pro"/>
-          <w:sz w:val="20"/>
-          <w:szCs w:val="20"/>
-        </w:rPr>
-        <w:t>true, :Type</w:t>
-      </w:r>
+        <w:t>4, false, true</w:t>
+      </w:r>
+      <w:proofErr w:type="gramStart"/>
+      <w:r>
+        <w:rPr>
+          <w:rFonts w:ascii="Source Code Pro" w:hAnsi="Source Code Pro"/>
+          <w:sz w:val="20"/>
+          <w:szCs w:val="20"/>
+        </w:rPr>
+        <w:t>, :Type</w:t>
+      </w:r>
+      <w:proofErr w:type="gramEnd"/>
       <w:r>
         <w:rPr>
           <w:rFonts w:ascii="Source Code Pro" w:hAnsi="Source Code Pro"/>
@@ -2319,16 +2400,7 @@
         <w:t xml:space="preserve">=&gt; </w:t>
       </w:r>
       <w:r>
-        <w:t xml:space="preserve">Opens a Berry selection scene for the player to choose exactly </w:t>
-      </w:r>
-      <w:r>
-        <w:t>4</w:t>
-      </w:r>
-      <w:r>
-        <w:t xml:space="preserve"> Berries</w:t>
-      </w:r>
-      <w:r>
-        <w:t xml:space="preserve">, showing the Berry’s </w:t>
+        <w:t xml:space="preserve">Opens a Berry selection scene for the player to choose exactly 4 Berries, showing the Berry’s </w:t>
       </w:r>
       <w:proofErr w:type="spellStart"/>
       <w:r>
@@ -2340,16 +2412,7 @@
       </w:r>
       <w:r>
         <w:lastRenderedPageBreak/>
-        <w:t>a label</w:t>
-      </w:r>
-      <w:r>
-        <w:t>. Returns the list of Berries as an array. The Berries chosen are removed</w:t>
-      </w:r>
-      <w:r>
-        <w:t xml:space="preserve"> from the bag</w:t>
-      </w:r>
-      <w:r>
-        <w:t>.</w:t>
+        <w:t>a label. Returns the list of Berries as an array. The Berries chosen are removed from the bag.</w:t>
       </w:r>
     </w:p>
     <w:p>
@@ -2392,8 +2455,105 @@
           <w:sz w:val="20"/>
           <w:szCs w:val="20"/>
         </w:rPr>
+        <w:t>Berry)</w:t>
+      </w:r>
+    </w:p>
+    <w:p>
+      <w:pPr>
+        <w:pStyle w:val="ListParagraph"/>
+        <w:numPr>
+          <w:ilvl w:val="0"/>
+          <w:numId w:val="2"/>
+        </w:numPr>
+      </w:pPr>
+      <w:r>
+        <w:t>Description: Returns the Natural Gift type and power of the berry as an array in the format of [&lt;type ID&gt;, power].</w:t>
+      </w:r>
+    </w:p>
+    <w:p>
+      <w:pPr>
+        <w:pStyle w:val="ListParagraph"/>
+        <w:numPr>
+          <w:ilvl w:val="0"/>
+          <w:numId w:val="2"/>
+        </w:numPr>
+      </w:pPr>
+      <w:r>
+        <w:t>Argument:</w:t>
+      </w:r>
+    </w:p>
+    <w:p>
+      <w:pPr>
+        <w:pStyle w:val="ListParagraph"/>
+        <w:numPr>
+          <w:ilvl w:val="1"/>
+          <w:numId w:val="2"/>
+        </w:numPr>
+      </w:pPr>
+      <w:r>
         <w:t>Berry</w:t>
       </w:r>
+    </w:p>
+    <w:p>
+      <w:pPr>
+        <w:pStyle w:val="ListParagraph"/>
+        <w:numPr>
+          <w:ilvl w:val="2"/>
+          <w:numId w:val="2"/>
+        </w:numPr>
+      </w:pPr>
+      <w:r>
+        <w:t>Required. A Berry ID.</w:t>
+      </w:r>
+    </w:p>
+    <w:p>
+      <w:pPr>
+        <w:pStyle w:val="ListParagraph"/>
+        <w:numPr>
+          <w:ilvl w:val="0"/>
+          <w:numId w:val="2"/>
+        </w:numPr>
+      </w:pPr>
+      <w:r>
+        <w:t>Example:</w:t>
+      </w:r>
+    </w:p>
+    <w:p>
+      <w:pPr>
+        <w:pStyle w:val="ListParagraph"/>
+        <w:numPr>
+          <w:ilvl w:val="1"/>
+          <w:numId w:val="2"/>
+        </w:numPr>
+      </w:pPr>
+      <w:proofErr w:type="spellStart"/>
+      <w:r>
+        <w:rPr>
+          <w:rFonts w:ascii="Source Code Pro" w:hAnsi="Source Code Pro"/>
+          <w:sz w:val="20"/>
+          <w:szCs w:val="20"/>
+        </w:rPr>
+        <w:t>pbBerryGetNaturalGift</w:t>
+      </w:r>
+      <w:proofErr w:type="spellEnd"/>
+      <w:proofErr w:type="gramStart"/>
+      <w:r>
+        <w:rPr>
+          <w:rFonts w:ascii="Source Code Pro" w:hAnsi="Source Code Pro"/>
+          <w:sz w:val="20"/>
+          <w:szCs w:val="20"/>
+        </w:rPr>
+        <w:t>(</w:t>
+      </w:r>
+      <w:r>
+        <w:rPr>
+          <w:rFonts w:ascii="Source Code Pro" w:hAnsi="Source Code Pro"/>
+          <w:sz w:val="20"/>
+          <w:szCs w:val="20"/>
+        </w:rPr>
+        <w:t>:ORANBERRY</w:t>
+      </w:r>
+      <w:proofErr w:type="gramEnd"/>
       <w:r>
         <w:rPr>
           <w:rFonts w:ascii="Source Code Pro" w:hAnsi="Source Code Pro"/>
@@ -2402,122 +2562,19 @@
         </w:rPr>
         <w:t>)</w:t>
       </w:r>
-    </w:p>
-    <w:p>
-      <w:pPr>
-        <w:pStyle w:val="ListParagraph"/>
-        <w:numPr>
-          <w:ilvl w:val="0"/>
-          <w:numId w:val="2"/>
-        </w:numPr>
-      </w:pPr>
-      <w:r>
-        <w:t xml:space="preserve">Description: </w:t>
-      </w:r>
-      <w:r>
-        <w:t>Returns the Natural Gift type and power of the berry as an array in the format of [&lt;type ID&gt;, power].</w:t>
-      </w:r>
-    </w:p>
-    <w:p>
-      <w:pPr>
-        <w:pStyle w:val="ListParagraph"/>
-        <w:numPr>
-          <w:ilvl w:val="0"/>
-          <w:numId w:val="2"/>
-        </w:numPr>
-      </w:pPr>
-      <w:r>
-        <w:t>Argument:</w:t>
-      </w:r>
-    </w:p>
-    <w:p>
-      <w:pPr>
-        <w:pStyle w:val="ListParagraph"/>
-        <w:numPr>
-          <w:ilvl w:val="1"/>
-          <w:numId w:val="2"/>
-        </w:numPr>
-      </w:pPr>
-      <w:r>
-        <w:t>Berry</w:t>
-      </w:r>
-    </w:p>
-    <w:p>
-      <w:pPr>
-        <w:pStyle w:val="ListParagraph"/>
-        <w:numPr>
-          <w:ilvl w:val="2"/>
-          <w:numId w:val="2"/>
-        </w:numPr>
-      </w:pPr>
-      <w:r>
-        <w:t>Required</w:t>
-      </w:r>
-      <w:r>
-        <w:t>. A Berry ID.</w:t>
-      </w:r>
-    </w:p>
-    <w:p>
-      <w:pPr>
-        <w:pStyle w:val="ListParagraph"/>
-        <w:numPr>
-          <w:ilvl w:val="0"/>
-          <w:numId w:val="2"/>
-        </w:numPr>
-      </w:pPr>
-      <w:r>
-        <w:t>Example:</w:t>
-      </w:r>
-    </w:p>
-    <w:p>
-      <w:pPr>
-        <w:pStyle w:val="ListParagraph"/>
-        <w:numPr>
-          <w:ilvl w:val="1"/>
-          <w:numId w:val="2"/>
-        </w:numPr>
-      </w:pPr>
-      <w:proofErr w:type="spellStart"/>
-      <w:r>
-        <w:rPr>
-          <w:rFonts w:ascii="Source Code Pro" w:hAnsi="Source Code Pro"/>
-          <w:sz w:val="20"/>
-          <w:szCs w:val="20"/>
-        </w:rPr>
-        <w:t>pbBerryGetNaturalGift</w:t>
-      </w:r>
-      <w:proofErr w:type="spellEnd"/>
+      <w:r>
+        <w:t xml:space="preserve">=&gt; </w:t>
+      </w:r>
+      <w:r>
+        <w:t xml:space="preserve">Returns </w:t>
+      </w:r>
       <w:proofErr w:type="gramStart"/>
       <w:r>
-        <w:rPr>
-          <w:rFonts w:ascii="Source Code Pro" w:hAnsi="Source Code Pro"/>
-          <w:sz w:val="20"/>
-          <w:szCs w:val="20"/>
-        </w:rPr>
-        <w:t>(</w:t>
-      </w:r>
-      <w:r>
-        <w:rPr>
-          <w:rFonts w:ascii="Source Code Pro" w:hAnsi="Source Code Pro"/>
-          <w:sz w:val="20"/>
-          <w:szCs w:val="20"/>
-        </w:rPr>
-        <w:t>:ORANBERRY</w:t>
+        <w:t>[:POISON</w:t>
       </w:r>
       <w:proofErr w:type="gramEnd"/>
       <w:r>
-        <w:rPr>
-          <w:rFonts w:ascii="Source Code Pro" w:hAnsi="Source Code Pro"/>
-          <w:sz w:val="20"/>
-          <w:szCs w:val="20"/>
-        </w:rPr>
-        <w:t>)</w:t>
-      </w:r>
-      <w:r>
-        <w:t xml:space="preserve">=&gt; </w:t>
-      </w:r>
-      <w:r>
-        <w:t>Returns [:POISON, 80]</w:t>
+        <w:t>, 80]</w:t>
       </w:r>
     </w:p>
     <w:p>
@@ -2586,7 +2643,7 @@
 </file>
 
 <file path=word/numbering.xml><?xml version="1.0" encoding="utf-8"?>
-<w:numbering xmlns:wpc="http://schemas.microsoft.com/office/word/2010/wordprocessingCanvas" xmlns:cx="http://schemas.microsoft.com/office/drawing/2014/chartex" xmlns:cx1="http://schemas.microsoft.com/office/drawing/2015/9/8/chartex" xmlns:cx2="http://schemas.microsoft.com/office/drawing/2015/10/21/chartex" xmlns:cx3="http://schemas.microsoft.com/office/drawing/2016/5/9/chartex" xmlns:cx4="http://schemas.microsoft.com/office/drawing/2016/5/10/chartex" xmlns:cx5="http://schemas.microsoft.com/office/drawing/2016/5/11/chartex" xmlns:cx6="http://schemas.microsoft.com/office/drawing/2016/5/12/chartex" xmlns:cx7="http://schemas.microsoft.com/office/drawing/2016/5/13/chartex" xmlns:cx8="http://schemas.microsoft.com/office/drawing/2016/5/14/chartex" xmlns:mc="http://schemas.openxmlformats.org/markup-compatibility/2006" xmlns:aink="http://schemas.microsoft.com/office/drawing/2016/ink" xmlns:am3d="http://schemas.microsoft.com/office/drawing/2017/model3d" xmlns:o="urn:schemas-microsoft-com:office:office" xmlns:oel="http://schemas.microsoft.com/office/2019/extlst" xmlns:r="http://schemas.openxmlformats.org/officeDocument/2006/relationships" xmlns:m="http://schemas.openxmlformats.org/officeDocument/2006/math" xmlns:v="urn:schemas-microsoft-com:vml" xmlns:wp14="http://schemas.microsoft.com/office/word/2010/wordprocessingDrawing" xmlns:wp="http://schemas.openxmlformats.org/drawingml/2006/wordprocessingDrawing" xmlns:w10="urn:schemas-microsoft-com:office:word" xmlns:w="http://schemas.openxmlformats.org/wordprocessingml/2006/main" xmlns:w14="http://schemas.microsoft.com/office/word/2010/wordml" xmlns:w15="http://schemas.microsoft.com/office/word/2012/wordml" xmlns:w16cex="http://schemas.microsoft.com/office/word/2018/wordml/cex" xmlns:w16cid="http://schemas.microsoft.com/office/word/2016/wordml/cid" xmlns:w16="http://schemas.microsoft.com/office/word/2018/wordml" xmlns:w16sdtdh="http://schemas.microsoft.com/office/word/2020/wordml/sdtdatahash" xmlns:w16se="http://schemas.microsoft.com/office/word/2015/wordml/symex" xmlns:wpg="http://schemas.microsoft.com/office/word/2010/wordprocessingGroup" xmlns:wpi="http://schemas.microsoft.com/office/word/2010/wordprocessingInk" xmlns:wne="http://schemas.microsoft.com/office/word/2006/wordml" xmlns:wps="http://schemas.microsoft.com/office/word/2010/wordprocessingShape" mc:Ignorable="w14 w15 w16se w16cid w16 w16cex w16sdtdh wp14">
+<w:numbering xmlns:wpc="http://schemas.microsoft.com/office/word/2010/wordprocessingCanvas" xmlns:cx="http://schemas.microsoft.com/office/drawing/2014/chartex" xmlns:cx1="http://schemas.microsoft.com/office/drawing/2015/9/8/chartex" xmlns:cx2="http://schemas.microsoft.com/office/drawing/2015/10/21/chartex" xmlns:cx3="http://schemas.microsoft.com/office/drawing/2016/5/9/chartex" xmlns:cx4="http://schemas.microsoft.com/office/drawing/2016/5/10/chartex" xmlns:cx5="http://schemas.microsoft.com/office/drawing/2016/5/11/chartex" xmlns:cx6="http://schemas.microsoft.com/office/drawing/2016/5/12/chartex" xmlns:cx7="http://schemas.microsoft.com/office/drawing/2016/5/13/chartex" xmlns:cx8="http://schemas.microsoft.com/office/drawing/2016/5/14/chartex" xmlns:mc="http://schemas.openxmlformats.org/markup-compatibility/2006" xmlns:aink="http://schemas.microsoft.com/office/drawing/2016/ink" xmlns:am3d="http://schemas.microsoft.com/office/drawing/2017/model3d" xmlns:o="urn:schemas-microsoft-com:office:office" xmlns:oel="http://schemas.microsoft.com/office/2019/extlst" xmlns:r="http://schemas.openxmlformats.org/officeDocument/2006/relationships" xmlns:m="http://schemas.openxmlformats.org/officeDocument/2006/math" xmlns:v="urn:schemas-microsoft-com:vml" xmlns:wp14="http://schemas.microsoft.com/office/word/2010/wordprocessingDrawing" xmlns:wp="http://schemas.openxmlformats.org/drawingml/2006/wordprocessingDrawing" xmlns:w10="urn:schemas-microsoft-com:office:word" xmlns:w="http://schemas.openxmlformats.org/wordprocessingml/2006/main" xmlns:w14="http://schemas.microsoft.com/office/word/2010/wordml" xmlns:w15="http://schemas.microsoft.com/office/word/2012/wordml" xmlns:w16cex="http://schemas.microsoft.com/office/word/2018/wordml/cex" xmlns:w16cid="http://schemas.microsoft.com/office/word/2016/wordml/cid" xmlns:w16="http://schemas.microsoft.com/office/word/2018/wordml" xmlns:w16du="http://schemas.microsoft.com/office/word/2023/wordml/word16du" xmlns:w16sdtdh="http://schemas.microsoft.com/office/word/2020/wordml/sdtdatahash" xmlns:w16sdtfl="http://schemas.microsoft.com/office/word/2024/wordml/sdtformatlock" xmlns:w16se="http://schemas.microsoft.com/office/word/2015/wordml/symex" xmlns:wpg="http://schemas.microsoft.com/office/word/2010/wordprocessingGroup" xmlns:wpi="http://schemas.microsoft.com/office/word/2010/wordprocessingInk" xmlns:wne="http://schemas.microsoft.com/office/word/2006/wordml" xmlns:wps="http://schemas.microsoft.com/office/word/2010/wordprocessingShape" mc:Ignorable="w14 w15 w16se w16cid w16 w16cex w16sdtdh w16sdtfl w16du wp14">
   <w:abstractNum w:abstractNumId="0" w15:restartNumberingAfterBreak="0">
     <w:nsid w:val="147F73B4"/>
     <w:multiLevelType w:val="hybridMultilevel"/>
@@ -3106,7 +3163,7 @@
 </file>
 
 <file path=word/styles.xml><?xml version="1.0" encoding="utf-8"?>
-<w:styles xmlns:mc="http://schemas.openxmlformats.org/markup-compatibility/2006" xmlns:r="http://schemas.openxmlformats.org/officeDocument/2006/relationships" xmlns:w="http://schemas.openxmlformats.org/wordprocessingml/2006/main" xmlns:w14="http://schemas.microsoft.com/office/word/2010/wordml" xmlns:w15="http://schemas.microsoft.com/office/word/2012/wordml" xmlns:w16cex="http://schemas.microsoft.com/office/word/2018/wordml/cex" xmlns:w16cid="http://schemas.microsoft.com/office/word/2016/wordml/cid" xmlns:w16="http://schemas.microsoft.com/office/word/2018/wordml" xmlns:w16sdtdh="http://schemas.microsoft.com/office/word/2020/wordml/sdtdatahash" xmlns:w16se="http://schemas.microsoft.com/office/word/2015/wordml/symex" mc:Ignorable="w14 w15 w16se w16cid w16 w16cex w16sdtdh">
+<w:styles xmlns:mc="http://schemas.openxmlformats.org/markup-compatibility/2006" xmlns:r="http://schemas.openxmlformats.org/officeDocument/2006/relationships" xmlns:w="http://schemas.openxmlformats.org/wordprocessingml/2006/main" xmlns:w14="http://schemas.microsoft.com/office/word/2010/wordml" xmlns:w15="http://schemas.microsoft.com/office/word/2012/wordml" xmlns:w16cex="http://schemas.microsoft.com/office/word/2018/wordml/cex" xmlns:w16cid="http://schemas.microsoft.com/office/word/2016/wordml/cid" xmlns:w16="http://schemas.microsoft.com/office/word/2018/wordml" xmlns:w16du="http://schemas.microsoft.com/office/word/2023/wordml/word16du" xmlns:w16sdtdh="http://schemas.microsoft.com/office/word/2020/wordml/sdtdatahash" xmlns:w16sdtfl="http://schemas.microsoft.com/office/word/2024/wordml/sdtformatlock" xmlns:w16se="http://schemas.microsoft.com/office/word/2015/wordml/symex" mc:Ignorable="w14 w15 w16se w16cid w16 w16cex w16sdtdh w16sdtfl w16du">
   <w:docDefaults>
     <w:rPrDefault>
       <w:rPr>

</xml_diff>